<commit_message>
Testing to see if i can link characters
</commit_message>
<xml_diff>
--- a/content/characters/Emilia-of-Vrey.docx
+++ b/content/characters/Emilia-of-Vrey.docx
@@ -14,7 +14,15 @@
         <w:t>Emilia</w:t>
       </w:r>
       <w:r>
-        <w:t xml:space="preserve"> of Vrey is the Princess of Vrey Empire during the reign of </w:t>
+        <w:t xml:space="preserve"> of Vrey </w:t>
+      </w:r>
+      <w:proofErr w:type="gramStart"/>
+      <w:r>
+        <w:t>is</w:t>
+      </w:r>
+      <w:proofErr w:type="gramEnd"/>
+      <w:r>
+        <w:t xml:space="preserve"> the Princess of Vrey Empire during the reign of </w:t>
       </w:r>
       <w:r>
         <w:t>Emperor Heinrich II of Vrey and Emperor Alfred of Vrey. She is a half-dwarf half-human.</w:t>
@@ -227,6 +235,9 @@
         <w:spacing w:before="240" w:after="240"/>
       </w:pPr>
       <w:r>
+        <w:t>[</w:t>
+      </w:r>
+      <w:r>
         <w:rPr>
           <w:b/>
           <w:bCs/>
@@ -234,7 +245,13 @@
         <w:t>Alfred of Vrey</w:t>
       </w:r>
       <w:r>
-        <w:t xml:space="preserve">: Alfred is Emilia’s older brother, and they are very close to each other. </w:t>
+        <w:t>](characters/Alfred-of-Vrey)</w:t>
+      </w:r>
+      <w:r>
+        <w:t>:</w:t>
+      </w:r>
+      <w:r>
+        <w:t xml:space="preserve"> Alfred is Emilia’s older brother, and they are very close to each other. </w:t>
       </w:r>
       <w:r>
         <w:t>Alfred often scolds</w:t>

</xml_diff>